<commit_message>
feat(module-02): harmonisation de la mise en page de l'exercice 02.a (Segoe UI, style identique) et generation du tutoriel pas-a-pas Power Query
</commit_message>
<xml_diff>
--- a/docs/public/documents/Exercice-02a.docx
+++ b/docs/public/documents/Exercice-02a.docx
@@ -4,153 +4,494 @@
   <w:body>
     <w:p>
       <w:pPr>
-        <w:spacing w:before="0" w:after="40"/>
-        <w:jc w:val="left"/>
+        <w:spacing w:before="0" w:after="240" w:line="276" w:lineRule="auto"/>
       </w:pPr>
       <w:r>
         <w:rPr>
           <w:rFonts w:ascii="Segoe UI" w:hAnsi="Segoe UI"/>
           <w:b/>
-          <w:color w:val="64748B"/>
-          <w:sz w:val="17"/>
-        </w:rPr>
-        <w:t>HAUTE ÉCOLE CHARLEMAGNE — SPÉCIALISATION EN PRÉPARATION PHYSIQUE</w:t>
-        <w:br/>
-      </w:r>
-      <w:r>
-        <w:rPr>
-          <w:rFonts w:ascii="Segoe UI" w:hAnsi="Segoe UI"/>
-          <w:b/>
-          <w:color w:val="1E3A8A"/>
-          <w:sz w:val="26"/>
+          <w:i w:val="0"/>
         </w:rPr>
         <w:t>Exercice 02.a — Extraction Power Query &amp; Monitoring Nutritionnel (Natation)</w:t>
       </w:r>
     </w:p>
     <w:p>
       <w:pPr>
-        <w:spacing w:before="60" w:after="80" w:line="252" w:lineRule="auto"/>
+        <w:spacing w:before="0" w:after="80" w:line="276" w:lineRule="auto"/>
       </w:pPr>
       <w:r>
         <w:rPr>
           <w:rFonts w:ascii="Segoe UI" w:hAnsi="Segoe UI"/>
           <w:b/>
-          <w:color w:val="0D9488"/>
-          <w:sz w:val="19"/>
+          <w:i w:val="0"/>
         </w:rPr>
-        <w:t>🎯 Mise en situation professionnelle :</w:t>
-        <w:br/>
+        <w:t>Cas professionnel</w:t>
+      </w:r>
+    </w:p>
+    <w:p>
+      <w:pPr>
+        <w:spacing w:before="0" w:after="120" w:line="276" w:lineRule="auto"/>
+      </w:pPr>
+      <w:r>
+        <w:rPr>
+          <w:rFonts w:ascii="Segoe UI" w:hAnsi="Segoe UI"/>
+        </w:rPr>
+        <w:t xml:space="preserve">Vous êtes </w:t>
       </w:r>
       <w:r>
         <w:rPr>
           <w:rFonts w:ascii="Segoe UI" w:hAnsi="Segoe UI"/>
-          <w:color w:val="1E293B"/>
-          <w:sz w:val="17"/>
+          <w:b/>
         </w:rPr>
-        <w:t>Vous êtes préparateur physique en charge d'un collectif de 8 nageurs de niveau national (sprint et demi-fond) en pleine phase de charge intensive pré-compétitive (doubles séances biquotidiennes en bassin + musculation). Pour prévenir les états de fatigue chronique, le syndrome de déficit énergétique relatif dans le sport (RED-S) et optimiser la surcompensation glycogénique, chaque athlète a saisi son journal nutritionnel quotidien pendant 7 jours. Votre mission : automatiser l'extraction et la transformation de ces données brutes avec l'outil Power Query d'Excel, calculer les ratios nutritionnels relatifs au poids corporel (g/kg/j) et produire un diagnostic d'aide à la décision pour le staff.</w:t>
+        <w:t>préparateur physique en charge d'un collectif de 8 nageurs de haut niveau</w:t>
+      </w:r>
+      <w:r>
+        <w:rPr>
+          <w:rFonts w:ascii="Segoe UI" w:hAnsi="Segoe UI"/>
+        </w:rPr>
+        <w:t xml:space="preserve"> (sprint et demi-fond). Le staff technique organise un cycle intensif pré-compétitif de 7 jours comprenant des doubles séances quotidiennes en bassin et du renforcement musculaire à sec.</w:t>
       </w:r>
     </w:p>
     <w:p>
       <w:pPr>
-        <w:spacing w:before="60" w:after="80" w:line="252" w:lineRule="auto"/>
+        <w:spacing w:before="0" w:after="120" w:line="276" w:lineRule="auto"/>
+      </w:pPr>
+      <w:r>
+        <w:rPr>
+          <w:rFonts w:ascii="Segoe UI" w:hAnsi="Segoe UI"/>
+        </w:rPr>
+        <w:t>Pour prévenir les risques de surentraînement, le syndrome de déficit énergétique relatif dans le sport (RED-S) et optimiser la restauration glycogénique, chaque athlète saisit quotidiennement son journal nutritionnel et ses perceptions de récupération.</w:t>
+      </w:r>
+    </w:p>
+    <w:p>
+      <w:pPr>
+        <w:spacing w:before="0" w:after="240" w:line="276" w:lineRule="auto"/>
       </w:pPr>
       <w:r>
         <w:rPr>
           <w:rFonts w:ascii="Segoe UI" w:hAnsi="Segoe UI"/>
           <w:b/>
-          <w:color w:val="1E3A8A"/>
-          <w:sz w:val="19"/>
         </w:rPr>
-        <w:t>⚙️ Étape 1 : Extraction &amp; Transformation des données sous Power Query (Excel)</w:t>
-        <w:br/>
+        <w:t xml:space="preserve">Objectif : </w:t>
       </w:r>
       <w:r>
         <w:rPr>
           <w:rFonts w:ascii="Segoe UI" w:hAnsi="Segoe UI"/>
-          <w:color w:val="1E293B"/>
-          <w:sz w:val="17"/>
         </w:rPr>
-        <w:t>1. Ouvrez un classeur Excel vierge et importez le fichier « Exercice 02a - Donnees brutes nutrition natation.xlsx » via l'onglet Données &gt; Obtenir des données &gt; À partir d'un fichier &gt; À partir d'un classeur Excel.</w:t>
-        <w:br/>
-        <w:t>2. Dans la fenêtre du Navigateur, sélectionnez la table « Export_Brut_Nutrition » et cliquez impérativement sur Transformer les données.</w:t>
-        <w:br/>
-        <w:t>3. Dans l'Éditeur Power Query :</w:t>
-        <w:br/>
-        <w:t xml:space="preserve">   • Vérifiez et appliquez les types de données adéquats (Date, Texte, Nombre décimal pour le poids/distance, Nombre entier pour calories/glucides).</w:t>
-        <w:br/>
-        <w:t xml:space="preserve">   • Ajoutez des Colonnes personnalisées calculées pour normaliser les apports selon le poids de corps de chaque athlète :</w:t>
-        <w:br/>
-        <w:t xml:space="preserve">       - [Glucides_g_kg] = [Glucides_g] / [Poids_kg] (arrondi à 1 décimale)</w:t>
-        <w:br/>
-        <w:t xml:space="preserve">       - [Proteines_g_kg] = [Proteines_g] / [Poids_kg] (arrondi à 1 décimale)</w:t>
-        <w:br/>
-        <w:t xml:space="preserve">       - [Lipides_g_kg] = [Lipides_g] / [Poids_kg] (arrondi à 1 décimale)</w:t>
-        <w:br/>
-        <w:t xml:space="preserve">   • Créez une Colonne conditionnelle [Alerte_Glucides] : Si [Charge_RPE_UA] &gt;= 600 et [Glucides_g_kg] &lt; 6.0 alors « Déficit critique », sinon « Conforme ».</w:t>
-        <w:br/>
-        <w:t>4. Cliquez sur Fermer et charger dans... et chargez le résultat sous forme de Tableau structuré dans une feuille nommée « Extraction_PowerQuery ».</w:t>
+        <w:t>automatiser dans Microsoft Excel l'importation et la transformation des données nutritionnelles brutes grâce à l'outil Power Query, calculer les ratios nutritionnels relatifs au poids corporel et fournir un diagnostic décisionnel au staff d'entraînement.</w:t>
       </w:r>
     </w:p>
     <w:p>
       <w:pPr>
-        <w:spacing w:before="60" w:after="80" w:line="252" w:lineRule="auto"/>
+        <w:spacing w:before="0" w:after="80" w:line="276" w:lineRule="auto"/>
       </w:pPr>
       <w:r>
         <w:rPr>
           <w:rFonts w:ascii="Segoe UI" w:hAnsi="Segoe UI"/>
           <w:b/>
-          <w:color w:val="1E3A8A"/>
-          <w:sz w:val="19"/>
+          <w:i w:val="0"/>
         </w:rPr>
-        <w:t>📊 Étape 2 : Analyse décisionnelle du Préparateur Physique (Grille d'interprétation)</w:t>
-        <w:br/>
-      </w:r>
-      <w:r>
-        <w:rPr>
-          <w:rFonts w:ascii="Segoe UI" w:hAnsi="Segoe UI"/>
-          <w:color w:val="1E293B"/>
-          <w:sz w:val="17"/>
-        </w:rPr>
-        <w:t>À partir de votre table extraite et de l'onglet « Profils_Reperes_Staff », répondez aux 4 questions professionnelles suivantes :</w:t>
-        <w:br/>
-        <w:t>• Question 1 (Disponibilité énergétique &amp; Glucides) : Identifiez le ou les athlètes présentant un apport glucidique insuffisant par rapport à leur volume kilométrique et leur charge RPE lors des journées à haute intensité (Mardi/Jeudi). Quelles sont les conséquences neuromusculaires directes en bassin ?</w:t>
-        <w:br/>
-        <w:t>• Question 2 (Récupération protéique) : Les cibles protéiques (1.6 à 2.2 g/kg/j) sont-elles respectées pour les profils axés sur la force (nageurs de brasse et sprint) ? Justifiez l'importance du timing d'ingestion post-séance de musculation.</w:t>
-        <w:br/>
-        <w:t>• Question 3 (Hydratation &amp; Charge d'entraînement) : Croisez les apports hydriques (L/jour) avec les distances nagées. Quel nageur présente un risque d'hypohydratation menaçant la thermorégulation et augmentant la perception de l'effort (RPE) ?</w:t>
-        <w:br/>
-        <w:t>• Question 4 (Recommandations staff) : Rédigez 3 ajustements nutritionnels concrets et individualisés à transmettre aux entraîneurs pour la semaine suivante.</w:t>
+        <w:t>1. Importer et transformer les données avec Power Query</w:t>
       </w:r>
     </w:p>
     <w:p>
       <w:pPr>
-        <w:spacing w:before="60" w:after="0" w:line="252" w:lineRule="auto"/>
+        <w:spacing w:before="0" w:after="80" w:line="276" w:lineRule="auto"/>
+      </w:pPr>
+      <w:r>
+        <w:rPr>
+          <w:rFonts w:ascii="Segoe UI" w:hAnsi="Segoe UI"/>
+          <w:b w:val="0"/>
+          <w:i w:val="0"/>
+        </w:rPr>
+        <w:t>À partir du fichier fourni « Exercice 02a - Donnees brutes nutrition natation.xlsx » :</w:t>
+      </w:r>
+    </w:p>
+    <w:p>
+      <w:pPr>
+        <w:pStyle w:val="ListBullet"/>
+        <w:spacing w:before="0" w:after="60" w:line="276" w:lineRule="auto"/>
       </w:pPr>
       <w:r>
         <w:rPr>
           <w:rFonts w:ascii="Segoe UI" w:hAnsi="Segoe UI"/>
           <w:b/>
-          <w:color w:val="0D9488"/>
-          <w:sz w:val="18"/>
         </w:rPr>
-        <w:t>📁 Livrable attendu &amp; Barème d'évaluation (Sur 10 points) :</w:t>
-        <w:br/>
+        <w:t xml:space="preserve">Importation : </w:t>
       </w:r>
       <w:r>
         <w:rPr>
           <w:rFonts w:ascii="Segoe UI" w:hAnsi="Segoe UI"/>
-          <w:i/>
-          <w:color w:val="1E293B"/>
-          <w:sz w:val="16"/>
         </w:rPr>
-        <w:t>• Livrable : Déposez sur votre Espace Membre votre classeur Excel (.xlsx) contenant la requête Power Query active et votre feuille d'interprétation rédigée (ou un document Word d'analyse associé).</w:t>
-        <w:br/>
-        <w:t>• Barème : Automatisation de la requête Power Query et colonnes calculées (4 pts) | Diagnostic individualisé des risques (RED-S, glycogène, hydratation) (3 pts) | Pertinence et réalisme des recommandations pour le staff (2 pts) | Qualité de présentation et rigueur métrologique (1 pt).</w:t>
+        <w:t>Dans Excel, accédez à l'onglet Données &gt; Obtenir des données &gt; À partir d'un fichier &gt; À partir d'un classeur Excel.</w:t>
+      </w:r>
+    </w:p>
+    <w:p>
+      <w:pPr>
+        <w:pStyle w:val="ListBullet"/>
+        <w:spacing w:before="0" w:after="60" w:line="276" w:lineRule="auto"/>
+      </w:pPr>
+      <w:r>
+        <w:rPr>
+          <w:rFonts w:ascii="Segoe UI" w:hAnsi="Segoe UI"/>
+          <w:b/>
+        </w:rPr>
+        <w:t xml:space="preserve">Navigateur : </w:t>
+      </w:r>
+      <w:r>
+        <w:rPr>
+          <w:rFonts w:ascii="Segoe UI" w:hAnsi="Segoe UI"/>
+        </w:rPr>
+        <w:t>Sélectionnez la table « Export_Brut_Nutrition » et cliquez sur Transformer les données pour ouvrir l'éditeur Power Query.</w:t>
+      </w:r>
+    </w:p>
+    <w:p>
+      <w:pPr>
+        <w:pStyle w:val="ListBullet"/>
+        <w:spacing w:before="0" w:after="60" w:line="276" w:lineRule="auto"/>
+      </w:pPr>
+      <w:r>
+        <w:rPr>
+          <w:rFonts w:ascii="Segoe UI" w:hAnsi="Segoe UI"/>
+          <w:b/>
+        </w:rPr>
+        <w:t xml:space="preserve">Typage strict : </w:t>
+      </w:r>
+      <w:r>
+        <w:rPr>
+          <w:rFonts w:ascii="Segoe UI" w:hAnsi="Segoe UI"/>
+        </w:rPr>
+        <w:t>Contrôlez les types détectés par Power Query (Date, Texte, Nombre décimal pour le poids et les distances, Nombre entier pour les calories et macronutriments). Corrigez manuellement si nécessaire.</w:t>
+      </w:r>
+    </w:p>
+    <w:p>
+      <w:pPr>
+        <w:pStyle w:val="ListBullet"/>
+        <w:spacing w:before="0" w:after="200" w:line="276" w:lineRule="auto"/>
+      </w:pPr>
+      <w:r>
+        <w:rPr>
+          <w:rFonts w:ascii="Segoe UI" w:hAnsi="Segoe UI"/>
+          <w:b/>
+        </w:rPr>
+        <w:t xml:space="preserve">Nettoyage : </w:t>
+      </w:r>
+      <w:r>
+        <w:rPr>
+          <w:rFonts w:ascii="Segoe UI" w:hAnsi="Segoe UI"/>
+        </w:rPr>
+        <w:t>Assurez-vous qu'aucune valeur aberrante, négative ou manquante ne corrompt le jeu de données.</w:t>
+      </w:r>
+    </w:p>
+    <w:p>
+      <w:pPr>
+        <w:spacing w:before="0" w:after="80" w:line="276" w:lineRule="auto"/>
+      </w:pPr>
+      <w:r>
+        <w:rPr>
+          <w:rFonts w:ascii="Segoe UI" w:hAnsi="Segoe UI"/>
+          <w:b/>
+          <w:i w:val="0"/>
+        </w:rPr>
+        <w:t>2. Créer des indicateurs nutritionnels personnalisés</w:t>
+      </w:r>
+    </w:p>
+    <w:p>
+      <w:pPr>
+        <w:spacing w:before="0" w:after="80" w:line="276" w:lineRule="auto"/>
+      </w:pPr>
+      <w:r>
+        <w:rPr>
+          <w:rFonts w:ascii="Segoe UI" w:hAnsi="Segoe UI"/>
+          <w:b w:val="0"/>
+          <w:i w:val="0"/>
+        </w:rPr>
+        <w:t>En préparation physique, évaluer un apport nutritionnel brut en grammes n'a pas de sens physiologique sans le rapporter au gabarit de l'athlète. Dans l'éditeur Power Query (onglet Ajouter une colonne &gt; Colonne personnalisée), calculez :</w:t>
+      </w:r>
+    </w:p>
+    <w:p>
+      <w:pPr>
+        <w:pStyle w:val="ListBullet"/>
+        <w:spacing w:before="0" w:after="60" w:line="276" w:lineRule="auto"/>
+      </w:pPr>
+      <w:r>
+        <w:rPr>
+          <w:rFonts w:ascii="Segoe UI" w:hAnsi="Segoe UI"/>
+          <w:b/>
+        </w:rPr>
+        <w:t xml:space="preserve">Apport glucidique relatif [Glucides_g_kg] : </w:t>
+      </w:r>
+      <w:r>
+        <w:rPr>
+          <w:rFonts w:ascii="Segoe UI" w:hAnsi="Segoe UI"/>
+        </w:rPr>
+        <w:t>[Glucides_g] / [Poids_kg] (cible recommandée en natation : 6.0 à 10.0 g/kg/j selon le volume kilométrique).</w:t>
+      </w:r>
+    </w:p>
+    <w:p>
+      <w:pPr>
+        <w:pStyle w:val="ListBullet"/>
+        <w:spacing w:before="0" w:after="60" w:line="276" w:lineRule="auto"/>
+      </w:pPr>
+      <w:r>
+        <w:rPr>
+          <w:rFonts w:ascii="Segoe UI" w:hAnsi="Segoe UI"/>
+          <w:b/>
+        </w:rPr>
+        <w:t xml:space="preserve">Apport protéique relatif [Proteines_g_kg] : </w:t>
+      </w:r>
+      <w:r>
+        <w:rPr>
+          <w:rFonts w:ascii="Segoe UI" w:hAnsi="Segoe UI"/>
+        </w:rPr>
+        <w:t>[Proteines_g] / [Poids_kg] (cible recommandée : 1.6 à 2.2 g/kg/j pour la synthèse musculaire).</w:t>
+      </w:r>
+    </w:p>
+    <w:p>
+      <w:pPr>
+        <w:pStyle w:val="ListBullet"/>
+        <w:spacing w:before="0" w:after="60" w:line="276" w:lineRule="auto"/>
+      </w:pPr>
+      <w:r>
+        <w:rPr>
+          <w:rFonts w:ascii="Segoe UI" w:hAnsi="Segoe UI"/>
+          <w:b/>
+        </w:rPr>
+        <w:t xml:space="preserve">Apport lipidique relatif [Lipides_g_kg] : </w:t>
+      </w:r>
+      <w:r>
+        <w:rPr>
+          <w:rFonts w:ascii="Segoe UI" w:hAnsi="Segoe UI"/>
+        </w:rPr>
+        <w:t>[Lipides_g] / [Poids_kg] (maintien hormonal et énergétique).</w:t>
+      </w:r>
+    </w:p>
+    <w:p>
+      <w:pPr>
+        <w:pStyle w:val="ListBullet"/>
+        <w:spacing w:before="0" w:after="200" w:line="276" w:lineRule="auto"/>
+      </w:pPr>
+      <w:r>
+        <w:rPr>
+          <w:rFonts w:ascii="Segoe UI" w:hAnsi="Segoe UI"/>
+          <w:b/>
+        </w:rPr>
+        <w:t xml:space="preserve">Règle d'alerte conditionnelle : </w:t>
+      </w:r>
+      <w:r>
+        <w:rPr>
+          <w:rFonts w:ascii="Segoe UI" w:hAnsi="Segoe UI"/>
+        </w:rPr>
+        <w:t>Ajoutez une colonne conditionnelle [Alerte_Glucides] : si la charge d'entraînement [Charge_RPE_UA] &gt;= 600 et [Glucides_g_kg] &lt; 6.0, affichez « Alerte Déficit », sinon « Conforme ».</w:t>
+      </w:r>
+    </w:p>
+    <w:p>
+      <w:pPr>
+        <w:spacing w:before="0" w:after="80" w:line="276" w:lineRule="auto"/>
+      </w:pPr>
+      <w:r>
+        <w:rPr>
+          <w:rFonts w:ascii="Segoe UI" w:hAnsi="Segoe UI"/>
+          <w:b/>
+          <w:i w:val="0"/>
+        </w:rPr>
+        <w:t>3. Chargement et modélisation sous Excel</w:t>
+      </w:r>
+    </w:p>
+    <w:p>
+      <w:pPr>
+        <w:pStyle w:val="ListBullet"/>
+        <w:spacing w:before="0" w:after="60" w:line="276" w:lineRule="auto"/>
+      </w:pPr>
+      <w:r>
+        <w:rPr>
+          <w:rFonts w:ascii="Segoe UI" w:hAnsi="Segoe UI"/>
+          <w:b/>
+        </w:rPr>
+        <w:t xml:space="preserve">Chargement : </w:t>
+      </w:r>
+      <w:r>
+        <w:rPr>
+          <w:rFonts w:ascii="Segoe UI" w:hAnsi="Segoe UI"/>
+        </w:rPr>
+        <w:t>Cliquez sur Fermer et charger dans... et chargez les données sous la forme d'un Tableau Excel dans une feuille nommée « Extraction_PowerQuery ».</w:t>
+      </w:r>
+    </w:p>
+    <w:p>
+      <w:pPr>
+        <w:pStyle w:val="ListBullet"/>
+        <w:spacing w:before="0" w:after="200" w:line="276" w:lineRule="auto"/>
+      </w:pPr>
+      <w:r>
+        <w:rPr>
+          <w:rFonts w:ascii="Segoe UI" w:hAnsi="Segoe UI"/>
+          <w:b/>
+        </w:rPr>
+        <w:t xml:space="preserve">Automatisation : </w:t>
+      </w:r>
+      <w:r>
+        <w:rPr>
+          <w:rFonts w:ascii="Segoe UI" w:hAnsi="Segoe UI"/>
+        </w:rPr>
+        <w:t>L'extraction doit rester dynamique : si de nouvelles lignes sont ajoutées au fichier source, un simple clic droit &gt; Actualiser doit mettre à jour l'ensemble de vos calculs.</w:t>
+      </w:r>
+    </w:p>
+    <w:p>
+      <w:pPr>
+        <w:spacing w:before="0" w:after="80" w:line="276" w:lineRule="auto"/>
+      </w:pPr>
+      <w:r>
+        <w:rPr>
+          <w:rFonts w:ascii="Segoe UI" w:hAnsi="Segoe UI"/>
+          <w:b/>
+          <w:i w:val="0"/>
+        </w:rPr>
+        <w:t>4. Interprétation professionnelle et recommandations pour le staff</w:t>
+      </w:r>
+    </w:p>
+    <w:p>
+      <w:pPr>
+        <w:spacing w:before="0" w:after="80" w:line="276" w:lineRule="auto"/>
+      </w:pPr>
+      <w:r>
+        <w:rPr>
+          <w:rFonts w:ascii="Segoe UI" w:hAnsi="Segoe UI"/>
+          <w:b w:val="0"/>
+          <w:i w:val="0"/>
+        </w:rPr>
+        <w:t>En vous appuyant sur votre tableau extrait et sur l'onglet de référence « Profils_Reperes_Staff », répondez aux 4 questions professionnelles suivantes :</w:t>
+      </w:r>
+    </w:p>
+    <w:p>
+      <w:pPr>
+        <w:pStyle w:val="ListBullet"/>
+        <w:spacing w:before="0" w:after="60" w:line="276" w:lineRule="auto"/>
+      </w:pPr>
+      <w:r>
+        <w:rPr>
+          <w:rFonts w:ascii="Segoe UI" w:hAnsi="Segoe UI"/>
+          <w:b/>
+        </w:rPr>
+        <w:t xml:space="preserve">Question 1 — Disponibilité énergétique : </w:t>
+      </w:r>
+      <w:r>
+        <w:rPr>
+          <w:rFonts w:ascii="Segoe UI" w:hAnsi="Segoe UI"/>
+        </w:rPr>
+        <w:t>Quels athlètes présentent un déficit glucidique critique lors des journées à haute charge (Mardi et Jeudi) ? Quelles conséquences directes ce déficit entraîne-t-il sur la puissance musculaire en bassin et la surcompensation glycogénique ?</w:t>
+      </w:r>
+    </w:p>
+    <w:p>
+      <w:pPr>
+        <w:pStyle w:val="ListBullet"/>
+        <w:spacing w:before="0" w:after="60" w:line="276" w:lineRule="auto"/>
+      </w:pPr>
+      <w:r>
+        <w:rPr>
+          <w:rFonts w:ascii="Segoe UI" w:hAnsi="Segoe UI"/>
+          <w:b/>
+        </w:rPr>
+        <w:t xml:space="preserve">Question 2 — Récupération neuromusculaire : </w:t>
+      </w:r>
+      <w:r>
+        <w:rPr>
+          <w:rFonts w:ascii="Segoe UI" w:hAnsi="Segoe UI"/>
+        </w:rPr>
+        <w:t>Les cibles protéiques (1.6 à 2.2 g/kg/j) sont-elles atteintes pour les spécialistes de force et sprint (Maxime, Alexandre, Emma) ? Pourquoi le timing d'ingestion post-séance de musculation est-il déterminant ?</w:t>
+      </w:r>
+    </w:p>
+    <w:p>
+      <w:pPr>
+        <w:pStyle w:val="ListBullet"/>
+        <w:spacing w:before="0" w:after="60" w:line="276" w:lineRule="auto"/>
+      </w:pPr>
+      <w:r>
+        <w:rPr>
+          <w:rFonts w:ascii="Segoe UI" w:hAnsi="Segoe UI"/>
+          <w:b/>
+        </w:rPr>
+        <w:t xml:space="preserve">Question 3 — Hydratation &amp; Thermorégulation : </w:t>
+      </w:r>
+      <w:r>
+        <w:rPr>
+          <w:rFonts w:ascii="Segoe UI" w:hAnsi="Segoe UI"/>
+        </w:rPr>
+        <w:t>Identifiez les nageurs dont l'hydratation quotidienne est insuffisante au regard du kilométrage nagé. Quel est l'impact d'une hypohydratation de 2 % sur le RPE de Foster ?</w:t>
+      </w:r>
+    </w:p>
+    <w:p>
+      <w:pPr>
+        <w:pStyle w:val="ListBullet"/>
+        <w:spacing w:before="0" w:after="240" w:line="276" w:lineRule="auto"/>
+      </w:pPr>
+      <w:r>
+        <w:rPr>
+          <w:rFonts w:ascii="Segoe UI" w:hAnsi="Segoe UI"/>
+          <w:b/>
+        </w:rPr>
+        <w:t xml:space="preserve">Question 4 — Recommandations staff : </w:t>
+      </w:r>
+      <w:r>
+        <w:rPr>
+          <w:rFonts w:ascii="Segoe UI" w:hAnsi="Segoe UI"/>
+        </w:rPr>
+        <w:t>Rédigez 3 préconisations opérationnelles individualisées à l'attention de l'entraîneur principal et des nageurs pour la semaine de tapering suivante.</w:t>
+      </w:r>
+    </w:p>
+    <w:p>
+      <w:pPr>
+        <w:spacing w:before="0" w:after="80" w:line="276" w:lineRule="auto"/>
+      </w:pPr>
+      <w:r>
+        <w:rPr>
+          <w:rFonts w:ascii="Segoe UI" w:hAnsi="Segoe UI"/>
+          <w:b/>
+          <w:i w:val="0"/>
+        </w:rPr>
+        <w:t>Modalités de remise &amp; Barème (sur 5 points)</w:t>
+      </w:r>
+    </w:p>
+    <w:p>
+      <w:pPr>
+        <w:pStyle w:val="ListBullet"/>
+        <w:spacing w:before="0" w:after="60" w:line="276" w:lineRule="auto"/>
+      </w:pPr>
+      <w:r>
+        <w:rPr>
+          <w:rFonts w:ascii="Segoe UI" w:hAnsi="Segoe UI"/>
+          <w:b/>
+        </w:rPr>
+        <w:t xml:space="preserve">Livrable attendu : </w:t>
+      </w:r>
+      <w:r>
+        <w:rPr>
+          <w:rFonts w:ascii="Segoe UI" w:hAnsi="Segoe UI"/>
+        </w:rPr>
+        <w:t>Déposez sur votre Espace Membre votre classeur Excel (.xlsx) contenant la requête Power Query active et vos réponses rédigées (sur une feuille dédiée ou dans un document Word d'analyse).</w:t>
+      </w:r>
+    </w:p>
+    <w:p>
+      <w:pPr>
+        <w:pStyle w:val="ListBullet"/>
+        <w:spacing w:before="0" w:after="60" w:line="276" w:lineRule="auto"/>
+      </w:pPr>
+      <w:r>
+        <w:rPr>
+          <w:rFonts w:ascii="Segoe UI" w:hAnsi="Segoe UI"/>
+          <w:b/>
+        </w:rPr>
+        <w:t xml:space="preserve">Barème officiel : </w:t>
+      </w:r>
+      <w:r>
+        <w:rPr>
+          <w:rFonts w:ascii="Segoe UI" w:hAnsi="Segoe UI"/>
+        </w:rPr>
+        <w:t>Automatisation Power Query et colonnes calculées (2 pts) | Justesse du diagnostic physiologique (1.5 pt) | Pertinence des recommandations staff (1 pt) | Rigueur et présentation (0.5 pt).</w:t>
       </w:r>
     </w:p>
     <w:sectPr>
       <w:pgSz w:w="11909" w:h="16834"/>
-      <w:pgMar w:top="792" w:right="936" w:bottom="792" w:left="936" w:header="720" w:footer="720" w:gutter="0"/>
+      <w:pgMar w:top="1417" w:right="1417" w:bottom="1417" w:left="1417" w:header="720" w:footer="720" w:gutter="0"/>
       <w:cols w:space="720"/>
       <w:docGrid w:linePitch="360"/>
     </w:sectPr>

</xml_diff>